<commit_message>
feat(clientes): add NIT field across the full vertical slice
- DB: add NIT NVARCHAR(20) NULL to dbo.Clientes (ALTER + table script migration guard)
- SPs: include NIT in sp_ClienteCreate/Update/GetAll/GetById and in the @Search filter
- Domain: add NIT to Cliente entity
- Application: add NIT to Create/Update requests and ClienteResponse, validation (max 20) and mapping
- Infrastructure: pass @NIT in ADO.NET Create/Update and map NIT in the reader
- WinForms: add NIT label/textbox, grid column, binding on load/save/edit, search placeholder
- Docs: update Clientes.docx (revision log, campos, data dictionary, SP params)
</commit_message>
<xml_diff>
--- a/onpremise/docs/Clientes.docx
+++ b/onpremise/docs/Clientes.docx
@@ -172,6 +172,38 @@
                 <w:sz w:val="18"/>
               </w:rPr>
               <w:t>Creación inicial del módulo Clientes (CRUD, búsqueda, paginado, soft delete) con Clean Architecture.</w:t>
+            </w:r>
+          </w:p>
+        </w:tc>
+      </w:tr>
+      <w:tr>
+        <w:tc>
+          <w:tcPr>
+            <w:tcW w:type="dxa" w:w="2880"/>
+          </w:tcPr>
+          <w:p>
+            <w:r>
+              <w:t>1.1</w:t>
+            </w:r>
+          </w:p>
+        </w:tc>
+        <w:tc>
+          <w:tcPr>
+            <w:tcW w:type="dxa" w:w="2880"/>
+          </w:tcPr>
+          <w:p>
+            <w:r>
+              <w:t>26/10/2026</w:t>
+            </w:r>
+          </w:p>
+        </w:tc>
+        <w:tc>
+          <w:tcPr>
+            <w:tcW w:type="dxa" w:w="2880"/>
+          </w:tcPr>
+          <w:p>
+            <w:r>
+              <w:t>Se agrega el campo NIT (NVARCHAR(20), opcional) al modulo Clientes: tabla dbo.Clientes, SPs Create/Update/GetAll/GetById (incluido en el filtro de busqueda), entidad de dominio, DTOs, repositorio ADO.NET, servicio, API y formulario WinForms ClienteForm.</w:t>
             </w:r>
           </w:p>
         </w:tc>
@@ -703,6 +735,38 @@
                 <w:sz w:val="18"/>
               </w:rPr>
               <w:t>Opcional, solo dígitos, máximo 20 caracteres.</w:t>
+            </w:r>
+          </w:p>
+        </w:tc>
+      </w:tr>
+      <w:tr>
+        <w:tc>
+          <w:tcPr>
+            <w:tcW w:type="dxa" w:w="2880"/>
+          </w:tcPr>
+          <w:p>
+            <w:r>
+              <w:t>NIT</w:t>
+            </w:r>
+          </w:p>
+        </w:tc>
+        <w:tc>
+          <w:tcPr>
+            <w:tcW w:type="dxa" w:w="2880"/>
+          </w:tcPr>
+          <w:p>
+            <w:r>
+              <w:t>No</w:t>
+            </w:r>
+          </w:p>
+        </w:tc>
+        <w:tc>
+          <w:tcPr>
+            <w:tcW w:type="dxa" w:w="2880"/>
+          </w:tcPr>
+          <w:p>
+            <w:r>
+              <w:t>Opcional, texto libre hasta 20 caracteres. Identificacion tributaria del cliente.</w:t>
             </w:r>
           </w:p>
         </w:tc>
@@ -1415,11 +1479,7 @@
     </w:tbl>
     <w:p>
       <w:r>
-        <w:rPr>
-          <w:b w:val="0"/>
-          <w:i/>
-        </w:rPr>
-        <w:t>Request de creación/edición (JSON): { "nombre": string, "direccion": string?, "telefono": string? }. Respuesta: objeto cliente con Id, Activo, FechaCreacion y FechaModificacion.</w:t>
+        <w:t>Request de creación/edición (JSON): { "nombre": string, "direccion": string?, "telefono": string?, "nit": string? }. Respuesta: objeto cliente con Id, Activo, FechaCreacion y FechaModificacion.</w:t>
       </w:r>
     </w:p>
     <w:p>
@@ -1512,12 +1572,8 @@
             <w:tcW w:type="dxa" w:w="2880"/>
           </w:tcPr>
           <w:p>
-            <w:r/>
             <w:r>
-              <w:rPr>
-                <w:sz w:val="18"/>
-              </w:rPr>
-              <w:t>@Nombre, @Direccion, @Telefono, @NewId OUT</w:t>
+              <w:t>@Nombre, @Direccion, @Telefono, @NIT, @NewId OUT</w:t>
             </w:r>
           </w:p>
         </w:tc>
@@ -1570,12 +1626,8 @@
             <w:tcW w:type="dxa" w:w="2880"/>
           </w:tcPr>
           <w:p>
-            <w:r/>
             <w:r>
-              <w:rPr>
-                <w:sz w:val="18"/>
-              </w:rPr>
-              <w:t>Total + página de activos; filtra por nombre/teléfono.</w:t>
+              <w:t>Total + página de activos; filtra por nombre/teléfono. Busqueda por Nombre, Telefono o NIT.</w:t>
             </w:r>
           </w:p>
         </w:tc>
@@ -2755,6 +2807,68 @@
           </w:p>
         </w:tc>
       </w:tr>
+      <w:tr>
+        <w:tc>
+          <w:tcPr>
+            <w:tcW w:type="dxa" w:w="1440"/>
+          </w:tcPr>
+          <w:p>
+            <w:r>
+              <w:t>NIT</w:t>
+            </w:r>
+          </w:p>
+        </w:tc>
+        <w:tc>
+          <w:tcPr>
+            <w:tcW w:type="dxa" w:w="1440"/>
+          </w:tcPr>
+          <w:p>
+            <w:r>
+              <w:t>NVARCHAR</w:t>
+            </w:r>
+          </w:p>
+        </w:tc>
+        <w:tc>
+          <w:tcPr>
+            <w:tcW w:type="dxa" w:w="1440"/>
+          </w:tcPr>
+          <w:p>
+            <w:r>
+              <w:t>20</w:t>
+            </w:r>
+          </w:p>
+        </w:tc>
+        <w:tc>
+          <w:tcPr>
+            <w:tcW w:type="dxa" w:w="1440"/>
+          </w:tcPr>
+          <w:p>
+            <w:r>
+              <w:t>Si</w:t>
+            </w:r>
+          </w:p>
+        </w:tc>
+        <w:tc>
+          <w:tcPr>
+            <w:tcW w:type="dxa" w:w="1440"/>
+          </w:tcPr>
+          <w:p>
+            <w:r>
+              <w:t>-</w:t>
+            </w:r>
+          </w:p>
+        </w:tc>
+        <w:tc>
+          <w:tcPr>
+            <w:tcW w:type="dxa" w:w="1440"/>
+          </w:tcPr>
+          <w:p>
+            <w:r>
+              <w:t>Numero de identificacion tributaria del cliente (opcional).</w:t>
+            </w:r>
+          </w:p>
+        </w:tc>
+      </w:tr>
     </w:tbl>
     <w:p>
       <w:pPr>

</xml_diff>